<commit_message>
II bobni qayta loyihalash: kesish jarayoni matematik modeli va control theory hisoblari (2.1-2.4)
</commit_message>
<xml_diff>
--- a/Metallni_kesish_avtomatlashtirish_MUNDARIJA.docx
+++ b/Metallni_kesish_avtomatlashtirish_MUNDARIJA.docx
@@ -546,7 +546,7 @@
           <w:sz w:val="28"/>
           <w:szCs w:val="28"/>
         </w:rPr>
-        <w:t xml:space="preserve">2.1. Kesish rejimlarini hisoblash (t, S, V)</w:t>
+        <w:t xml:space="preserve">2.1. Kesish rejimlari, kesish kuchlari va quvvatini hisoblash</w:t>
       </w:r>
       <w:r>
         <w:tab/>
@@ -574,102 +574,74 @@
           <w:sz w:val="28"/>
           <w:szCs w:val="28"/>
         </w:rPr>
-        <w:t xml:space="preserve">2.2. Kesish kuchlari va kesish quvvatini hisoblash</w:t>
-      </w:r>
-      <w:r>
-        <w:tab/>
-      </w:r>
-      <w:r>
-        <w:rPr>
-          <w:rFonts w:ascii="Times New Roman" w:hAnsi="Times New Roman" w:cs="Times New Roman"/>
-          <w:sz w:val="28"/>
-          <w:szCs w:val="28"/>
-        </w:rPr>
-        <w:t xml:space="preserve">25</w:t>
-      </w:r>
-    </w:p>
-    <w:p>
-      <w:pPr>
-        <w:tabs>
-          <w:tab w:val="right" w:leader="dot" w:pos="9639"/>
-        </w:tabs>
-        <w:ind w:left="360"/>
-        <w:spacing w:before="0" w:after="60" w:line="276" w:lineRule="auto"/>
-      </w:pPr>
-      <w:r>
-        <w:rPr>
-          <w:rFonts w:ascii="Times New Roman" w:hAnsi="Times New Roman" w:cs="Times New Roman"/>
-          <w:sz w:val="28"/>
-          <w:szCs w:val="28"/>
-        </w:rPr>
-        <w:t xml:space="preserve">2.3. Shpindel aylanish chastotasini aniqlash</w:t>
-      </w:r>
-      <w:r>
-        <w:tab/>
-      </w:r>
-      <w:r>
-        <w:rPr>
-          <w:rFonts w:ascii="Times New Roman" w:hAnsi="Times New Roman" w:cs="Times New Roman"/>
-          <w:sz w:val="28"/>
-          <w:szCs w:val="28"/>
-        </w:rPr>
-        <w:t xml:space="preserve">28</w:t>
-      </w:r>
-    </w:p>
-    <w:p>
-      <w:pPr>
-        <w:tabs>
-          <w:tab w:val="right" w:leader="dot" w:pos="9639"/>
-        </w:tabs>
-        <w:ind w:left="360"/>
-        <w:spacing w:before="0" w:after="60" w:line="276" w:lineRule="auto"/>
-      </w:pPr>
-      <w:r>
-        <w:rPr>
-          <w:rFonts w:ascii="Times New Roman" w:hAnsi="Times New Roman" w:cs="Times New Roman"/>
-          <w:sz w:val="28"/>
-          <w:szCs w:val="28"/>
-        </w:rPr>
-        <w:t xml:space="preserve">2.4. Asosiy (mashina) va yordamchi vaqtni hisoblash</w:t>
-      </w:r>
-      <w:r>
-        <w:tab/>
-      </w:r>
-      <w:r>
-        <w:rPr>
-          <w:rFonts w:ascii="Times New Roman" w:hAnsi="Times New Roman" w:cs="Times New Roman"/>
-          <w:sz w:val="28"/>
-          <w:szCs w:val="28"/>
-        </w:rPr>
-        <w:t xml:space="preserve">30</w:t>
-      </w:r>
-    </w:p>
-    <w:p>
-      <w:pPr>
-        <w:tabs>
-          <w:tab w:val="right" w:leader="dot" w:pos="9639"/>
-        </w:tabs>
-        <w:ind w:left="360"/>
-        <w:spacing w:before="0" w:after="60" w:line="276" w:lineRule="auto"/>
-      </w:pPr>
-      <w:r>
-        <w:rPr>
-          <w:rFonts w:ascii="Times New Roman" w:hAnsi="Times New Roman" w:cs="Times New Roman"/>
-          <w:sz w:val="28"/>
-          <w:szCs w:val="28"/>
-        </w:rPr>
-        <w:t xml:space="preserve">2.5. Asbob bardoshliligi va ishlov aniqligini hisoblash</w:t>
-      </w:r>
-      <w:r>
-        <w:tab/>
-      </w:r>
-      <w:r>
-        <w:rPr>
-          <w:rFonts w:ascii="Times New Roman" w:hAnsi="Times New Roman" w:cs="Times New Roman"/>
-          <w:sz w:val="28"/>
-          <w:szCs w:val="28"/>
-        </w:rPr>
-        <w:t xml:space="preserve">33</w:t>
+        <w:t xml:space="preserve">2.2. Kesish jarayonining matematik modelini tuzish</w:t>
+      </w:r>
+      <w:r>
+        <w:tab/>
+      </w:r>
+      <w:r>
+        <w:rPr>
+          <w:rFonts w:ascii="Times New Roman" w:hAnsi="Times New Roman" w:cs="Times New Roman"/>
+          <w:sz w:val="28"/>
+          <w:szCs w:val="28"/>
+        </w:rPr>
+        <w:t xml:space="preserve">27</w:t>
+      </w:r>
+    </w:p>
+    <w:p>
+      <w:pPr>
+        <w:tabs>
+          <w:tab w:val="right" w:leader="dot" w:pos="9639"/>
+        </w:tabs>
+        <w:ind w:left="360"/>
+        <w:spacing w:before="0" w:after="60" w:line="276" w:lineRule="auto"/>
+      </w:pPr>
+      <w:r>
+        <w:rPr>
+          <w:rFonts w:ascii="Times New Roman" w:hAnsi="Times New Roman" w:cs="Times New Roman"/>
+          <w:sz w:val="28"/>
+          <w:szCs w:val="28"/>
+        </w:rPr>
+        <w:t xml:space="preserve">2.3. Boshqaruv tizimini avtomatik boshqarish nazariyasi (control theory) asosida hisoblash</w:t>
+      </w:r>
+      <w:r>
+        <w:tab/>
+      </w:r>
+      <w:r>
+        <w:rPr>
+          <w:rFonts w:ascii="Times New Roman" w:hAnsi="Times New Roman" w:cs="Times New Roman"/>
+          <w:sz w:val="28"/>
+          <w:szCs w:val="28"/>
+        </w:rPr>
+        <w:t xml:space="preserve">32</w:t>
+      </w:r>
+    </w:p>
+    <w:p>
+      <w:pPr>
+        <w:tabs>
+          <w:tab w:val="right" w:leader="dot" w:pos="9639"/>
+        </w:tabs>
+        <w:ind w:left="360"/>
+        <w:spacing w:before="0" w:after="60" w:line="276" w:lineRule="auto"/>
+      </w:pPr>
+      <w:r>
+        <w:rPr>
+          <w:rFonts w:ascii="Times New Roman" w:hAnsi="Times New Roman" w:cs="Times New Roman"/>
+          <w:sz w:val="28"/>
+          <w:szCs w:val="28"/>
+        </w:rPr>
+        <w:t xml:space="preserve">2.4. Tizim turg‘unligini va o‘tkinchi jarayonlarni tahlil qilish (PID-rostlagichni sozlash)</w:t>
+      </w:r>
+      <w:r>
+        <w:tab/>
+      </w:r>
+      <w:r>
+        <w:rPr>
+          <w:rFonts w:ascii="Times New Roman" w:hAnsi="Times New Roman" w:cs="Times New Roman"/>
+          <w:sz w:val="28"/>
+          <w:szCs w:val="28"/>
+        </w:rPr>
+        <w:t xml:space="preserve">38</w:t>
       </w:r>
     </w:p>
     <w:p>
@@ -698,7 +670,7 @@
           <w:sz w:val="28"/>
           <w:szCs w:val="28"/>
         </w:rPr>
-        <w:t xml:space="preserve">36</w:t>
+        <w:t xml:space="preserve">43</w:t>
       </w:r>
     </w:p>
     <w:p>
@@ -726,7 +698,7 @@
           <w:sz w:val="28"/>
           <w:szCs w:val="28"/>
         </w:rPr>
-        <w:t xml:space="preserve">36</w:t>
+        <w:t xml:space="preserve">43</w:t>
       </w:r>
     </w:p>
     <w:p>
@@ -754,7 +726,7 @@
           <w:sz w:val="28"/>
           <w:szCs w:val="28"/>
         </w:rPr>
-        <w:t xml:space="preserve">38</w:t>
+        <w:t xml:space="preserve">45</w:t>
       </w:r>
     </w:p>
     <w:p>
@@ -782,7 +754,7 @@
           <w:sz w:val="28"/>
           <w:szCs w:val="28"/>
         </w:rPr>
-        <w:t xml:space="preserve">41</w:t>
+        <w:t xml:space="preserve">48</w:t>
       </w:r>
     </w:p>
     <w:p>
@@ -810,7 +782,7 @@
           <w:sz w:val="28"/>
           <w:szCs w:val="28"/>
         </w:rPr>
-        <w:t xml:space="preserve">44</w:t>
+        <w:t xml:space="preserve">51</w:t>
       </w:r>
     </w:p>
     <w:p>
@@ -838,7 +810,7 @@
           <w:sz w:val="28"/>
           <w:szCs w:val="28"/>
         </w:rPr>
-        <w:t xml:space="preserve">47</w:t>
+        <w:t xml:space="preserve">54</w:t>
       </w:r>
     </w:p>
     <w:p>
@@ -866,7 +838,7 @@
           <w:sz w:val="28"/>
           <w:szCs w:val="28"/>
         </w:rPr>
-        <w:t xml:space="preserve">50</w:t>
+        <w:t xml:space="preserve">57</w:t>
       </w:r>
     </w:p>
     <w:p>
@@ -895,7 +867,7 @@
           <w:sz w:val="28"/>
           <w:szCs w:val="28"/>
         </w:rPr>
-        <w:t xml:space="preserve">54</w:t>
+        <w:t xml:space="preserve">61</w:t>
       </w:r>
     </w:p>
     <w:p>
@@ -923,7 +895,7 @@
           <w:sz w:val="28"/>
           <w:szCs w:val="28"/>
         </w:rPr>
-        <w:t xml:space="preserve">54</w:t>
+        <w:t xml:space="preserve">61</w:t>
       </w:r>
     </w:p>
     <w:p>
@@ -951,7 +923,7 @@
           <w:sz w:val="28"/>
           <w:szCs w:val="28"/>
         </w:rPr>
-        <w:t xml:space="preserve">56</w:t>
+        <w:t xml:space="preserve">63</w:t>
       </w:r>
     </w:p>
     <w:p>
@@ -979,7 +951,7 @@
           <w:sz w:val="28"/>
           <w:szCs w:val="28"/>
         </w:rPr>
-        <w:t xml:space="preserve">58</w:t>
+        <w:t xml:space="preserve">65</w:t>
       </w:r>
     </w:p>
     <w:p>
@@ -1007,7 +979,7 @@
           <w:sz w:val="28"/>
           <w:szCs w:val="28"/>
         </w:rPr>
-        <w:t xml:space="preserve">60</w:t>
+        <w:t xml:space="preserve">67</w:t>
       </w:r>
     </w:p>
     <w:p>
@@ -1035,7 +1007,7 @@
           <w:sz w:val="28"/>
           <w:szCs w:val="28"/>
         </w:rPr>
-        <w:t xml:space="preserve">62</w:t>
+        <w:t xml:space="preserve">69</w:t>
       </w:r>
     </w:p>
     <w:p>
@@ -1064,7 +1036,7 @@
           <w:sz w:val="28"/>
           <w:szCs w:val="28"/>
         </w:rPr>
-        <w:t xml:space="preserve">65</w:t>
+        <w:t xml:space="preserve">72</w:t>
       </w:r>
     </w:p>
     <w:p>
@@ -1092,7 +1064,7 @@
           <w:sz w:val="28"/>
           <w:szCs w:val="28"/>
         </w:rPr>
-        <w:t xml:space="preserve">65</w:t>
+        <w:t xml:space="preserve">72</w:t>
       </w:r>
     </w:p>
     <w:p>
@@ -1120,7 +1092,7 @@
           <w:sz w:val="28"/>
           <w:szCs w:val="28"/>
         </w:rPr>
-        <w:t xml:space="preserve">67</w:t>
+        <w:t xml:space="preserve">74</w:t>
       </w:r>
     </w:p>
     <w:p>
@@ -1148,7 +1120,7 @@
           <w:sz w:val="28"/>
           <w:szCs w:val="28"/>
         </w:rPr>
-        <w:t xml:space="preserve">69</w:t>
+        <w:t xml:space="preserve">76</w:t>
       </w:r>
     </w:p>
     <w:p>
@@ -1176,7 +1148,7 @@
           <w:sz w:val="28"/>
           <w:szCs w:val="28"/>
         </w:rPr>
-        <w:t xml:space="preserve">71</w:t>
+        <w:t xml:space="preserve">78</w:t>
       </w:r>
     </w:p>
     <w:p>
@@ -1204,7 +1176,7 @@
           <w:sz w:val="28"/>
           <w:szCs w:val="28"/>
         </w:rPr>
-        <w:t xml:space="preserve">73</w:t>
+        <w:t xml:space="preserve">80</w:t>
       </w:r>
     </w:p>
     <w:p>
@@ -1233,7 +1205,7 @@
           <w:sz w:val="28"/>
           <w:szCs w:val="28"/>
         </w:rPr>
-        <w:t xml:space="preserve">75</w:t>
+        <w:t xml:space="preserve">82</w:t>
       </w:r>
     </w:p>
     <w:p>
@@ -1262,7 +1234,7 @@
           <w:sz w:val="28"/>
           <w:szCs w:val="28"/>
         </w:rPr>
-        <w:t xml:space="preserve">77</w:t>
+        <w:t xml:space="preserve">84</w:t>
       </w:r>
     </w:p>
     <w:p>
@@ -1291,7 +1263,7 @@
           <w:sz w:val="28"/>
           <w:szCs w:val="28"/>
         </w:rPr>
-        <w:t xml:space="preserve">80</w:t>
+        <w:t xml:space="preserve">87</w:t>
       </w:r>
     </w:p>
     <w:sectPr>

</xml_diff>